<commit_message>
Add Report.md, remove junk folder
</commit_message>
<xml_diff>
--- a/docs/BIS470_Capstone_Report.docx
+++ b/docs/BIS470_Capstone_Report.docx
@@ -9,12 +9,6 @@
           <w:color w:val="EE0000"/>
         </w:rPr>
       </w:pPr>
-      <w:r>
-        <w:rPr>
-          <w:color w:val="EE0000"/>
-        </w:rPr>
-        <w:t>*Revised</w:t>
-      </w:r>
     </w:p>
     <w:p>
       <w:pPr>
@@ -139,18 +133,6 @@
       </w:r>
     </w:p>
     <w:p>
-      <w:pPr>
-        <w:spacing w:after="120"/>
-        <w:jc w:val="center"/>
-      </w:pPr>
-      <w:r>
-        <w:rPr>
-          <w:color w:val="444444"/>
-        </w:rPr>
-        <w:t>Due: April 26, 2026</w:t>
-      </w:r>
-    </w:p>
-    <w:p>
       <w:r>
         <w:br w:type="page"/>
       </w:r>
@@ -171,6 +153,7 @@
         <w:alias w:val="Table of Contents"/>
         <w:id w:val="-1027405645"/>
       </w:sdtPr>
+      <w:sdtEndPr/>
       <w:sdtContent>
         <w:p>
           <w:pPr>
@@ -13832,7 +13815,10 @@
         <w:t>;</w:t>
       </w:r>
       <w:r>
-        <w:t xml:space="preserve"> when regression is run on Florida alone, house size R² improves 15.7x to 0.3223. This finding confirms the real estate industry maxim that location is the dominant price determinant.</w:t>
+        <w:t xml:space="preserve"> when regression is run on Florida alone, house size R² improves 15.7x to 0.3223. This finding confirms the real estate industry maxim that locatio</w:t>
+      </w:r>
+      <w:r>
+        <w:t>n is the dominant price determinant.</w:t>
       </w:r>
     </w:p>
     <w:p/>

</xml_diff>

<commit_message>
Clean up report docx
</commit_message>
<xml_diff>
--- a/docs/BIS470_Capstone_Report.docx
+++ b/docs/BIS470_Capstone_Report.docx
@@ -105,7 +105,13 @@
         <w:rPr>
           <w:color w:val="444444"/>
         </w:rPr>
-        <w:t>Course: BIS 470</w:t>
+        <w:t>Course: BIS 47</w:t>
+      </w:r>
+      <w:r>
+        <w:rPr>
+          <w:color w:val="444444"/>
+        </w:rPr>
+        <w:t>0</w:t>
       </w:r>
     </w:p>
     <w:p>
@@ -13815,10 +13821,7 @@
         <w:t>;</w:t>
       </w:r>
       <w:r>
-        <w:t xml:space="preserve"> when regression is run on Florida alone, house size R² improves 15.7x to 0.3223. This finding confirms the real estate industry maxim that locatio</w:t>
-      </w:r>
-      <w:r>
-        <w:t>n is the dominant price determinant.</w:t>
+        <w:t xml:space="preserve"> when regression is run on Florida alone, house size R² improves 15.7x to 0.3223. This finding confirms the real estate industry maxim that location is the dominant price determinant.</w:t>
       </w:r>
     </w:p>
     <w:p/>

</xml_diff>